<commit_message>
2nd proto, remove markup around TT2 instructions like FOREACH, IF, etc.
</commit_message>
<xml_diff>
--- a/t/etc/tst_template.docx
+++ b/t/etc/tst_template.docx
@@ -21,6 +21,8 @@
         </w:rPr>
         <w:t>foo</w:t>
       </w:r>
+      <w:bookmarkStart w:id="0" w:name="_GoBack"/>
+      <w:bookmarkEnd w:id="0"/>
     </w:p>
     <w:p>
       <w:r>
@@ -48,7 +50,7 @@
     <w:p>
       <w:r>
         <w:rPr>
-          <w:highlight w:val="yellow"/>
+          <w:highlight w:val="green"/>
         </w:rPr>
         <w:t>FOREACH item IN list</w:t>
       </w:r>
@@ -63,6 +65,7 @@
       </w:pPr>
       <w:r>
         <w:rPr>
+          <w:b/>
           <w:highlight w:val="yellow"/>
         </w:rPr>
         <w:t>item.name</w:t>
@@ -80,7 +83,7 @@
     <w:p>
       <w:r>
         <w:rPr>
-          <w:highlight w:val="yellow"/>
+          <w:highlight w:val="green"/>
         </w:rPr>
         <w:t>END # foreach</w:t>
       </w:r>
@@ -110,7 +113,7 @@
           <w:p>
             <w:r>
               <w:rPr>
-                <w:highlight w:val="yellow"/>
+                <w:highlight w:val="green"/>
               </w:rPr>
               <w:t>FOREACH item IN list</w:t>
             </w:r>
@@ -135,8 +138,6 @@
               </w:rPr>
               <w:t>item.name</w:t>
             </w:r>
-            <w:bookmarkStart w:id="0" w:name="_GoBack"/>
-            <w:bookmarkEnd w:id="0"/>
           </w:p>
         </w:tc>
         <w:tc>
@@ -144,8 +145,14 @@
             <w:tcW w:w="4531" w:type="dxa"/>
           </w:tcPr>
           <w:p>
+            <w:pPr>
+              <w:rPr>
+                <w:i/>
+              </w:rPr>
+            </w:pPr>
             <w:r>
               <w:rPr>
+                <w:i/>
                 <w:highlight w:val="yellow"/>
               </w:rPr>
               <w:t>item.value</w:t>
@@ -161,7 +168,7 @@
           <w:p>
             <w:r>
               <w:rPr>
-                <w:highlight w:val="yellow"/>
+                <w:highlight w:val="green"/>
               </w:rPr>
               <w:t>END # foreach</w:t>
             </w:r>

</xml_diff>